<commit_message>
docs: adding theory for ex0
</commit_message>
<xml_diff>
--- a/docs/Pascal_Docs/Module_00_Pascal.docx
+++ b/docs/Pascal_Docs/Module_00_Pascal.docx
@@ -1,6 +1,6 @@
 
 <file path=word/document.xml><?xml version="1.0" encoding="utf-8"?>
-<w:document xmlns:wpc="http://schemas.microsoft.com/office/word/2010/wordprocessingCanvas" xmlns:cx="http://schemas.microsoft.com/office/drawing/2014/chartex" xmlns:cx1="http://schemas.microsoft.com/office/drawing/2015/9/8/chartex" xmlns:cx2="http://schemas.microsoft.com/office/drawing/2015/10/21/chartex" xmlns:cx3="http://schemas.microsoft.com/office/drawing/2016/5/9/chartex" xmlns:cx4="http://schemas.microsoft.com/office/drawing/2016/5/10/chartex" xmlns:cx5="http://schemas.microsoft.com/office/drawing/2016/5/11/chartex" xmlns:cx6="http://schemas.microsoft.com/office/drawing/2016/5/12/chartex" xmlns:cx7="http://schemas.microsoft.com/office/drawing/2016/5/13/chartex" xmlns:cx8="http://schemas.microsoft.com/office/drawing/2016/5/14/chartex" xmlns:mc="http://schemas.openxmlformats.org/markup-compatibility/2006" xmlns:aink="http://schemas.microsoft.com/office/drawing/2016/ink" xmlns:am3d="http://schemas.microsoft.com/office/drawing/2017/model3d" xmlns:o="urn:schemas-microsoft-com:office:office" xmlns:oel="http://schemas.microsoft.com/office/2019/extlst" xmlns:r="http://schemas.openxmlformats.org/officeDocument/2006/relationships" xmlns:m="http://schemas.openxmlformats.org/officeDocument/2006/math" xmlns:v="urn:schemas-microsoft-com:vml" xmlns:wp14="http://schemas.microsoft.com/office/word/2010/wordprocessingDrawing" xmlns:wp="http://schemas.openxmlformats.org/drawingml/2006/wordprocessingDrawing" xmlns:w10="urn:schemas-microsoft-com:office:word" xmlns:w="http://schemas.openxmlformats.org/wordprocessingml/2006/main" xmlns:w14="http://schemas.microsoft.com/office/word/2010/wordml" xmlns:w15="http://schemas.microsoft.com/office/word/2012/wordml" xmlns:w16cei="http://schemas.microsoft.com/office/word/2026/wordml/cei" xmlns:w16cex="http://schemas.microsoft.com/office/word/2018/wordml/cex" xmlns:w16cid="http://schemas.microsoft.com/office/word/2016/wordml/cid" xmlns:w16="http://schemas.microsoft.com/office/word/2018/wordml" xmlns:w16du="http://schemas.microsoft.com/office/word/2023/wordml/word16du" xmlns:w16sdtdh="http://schemas.microsoft.com/office/word/2020/wordml/sdtdatahash" xmlns:w16sdtfl="http://schemas.microsoft.com/office/word/2024/wordml/sdtformatlock" xmlns:w16se="http://schemas.microsoft.com/office/word/2015/wordml/symex" xmlns:wpg="http://schemas.microsoft.com/office/word/2010/wordprocessingGroup" xmlns:wpi="http://schemas.microsoft.com/office/word/2010/wordprocessingInk" xmlns:wne="http://schemas.microsoft.com/office/word/2006/wordml" xmlns:wps="http://schemas.microsoft.com/office/word/2010/wordprocessingShape" mc:Ignorable="w14 w15 w16se w16cid w16 w16cex w16sdtdh w16sdtfl w16du wp14">
+<w:document xmlns:wpc="http://schemas.microsoft.com/office/word/2010/wordprocessingCanvas" xmlns:cx="http://schemas.microsoft.com/office/drawing/2014/chartex" xmlns:cx1="http://schemas.microsoft.com/office/drawing/2015/9/8/chartex" xmlns:cx2="http://schemas.microsoft.com/office/drawing/2015/10/21/chartex" xmlns:cx3="http://schemas.microsoft.com/office/drawing/2016/5/9/chartex" xmlns:cx4="http://schemas.microsoft.com/office/drawing/2016/5/10/chartex" xmlns:cx5="http://schemas.microsoft.com/office/drawing/2016/5/11/chartex" xmlns:cx6="http://schemas.microsoft.com/office/drawing/2016/5/12/chartex" xmlns:cx7="http://schemas.microsoft.com/office/drawing/2016/5/13/chartex" xmlns:cx8="http://schemas.microsoft.com/office/drawing/2016/5/14/chartex" xmlns:mc="http://schemas.openxmlformats.org/markup-compatibility/2006" xmlns:aink="http://schemas.microsoft.com/office/drawing/2016/ink" xmlns:am3d="http://schemas.microsoft.com/office/drawing/2017/model3d" xmlns:o="urn:schemas-microsoft-com:office:office" xmlns:oel="http://schemas.microsoft.com/office/2019/extlst" xmlns:r="http://schemas.openxmlformats.org/officeDocument/2006/relationships" xmlns:m="http://schemas.openxmlformats.org/officeDocument/2006/math" xmlns:v="urn:schemas-microsoft-com:vml" xmlns:wp14="http://schemas.microsoft.com/office/word/2010/wordprocessingDrawing" xmlns:wp="http://schemas.openxmlformats.org/drawingml/2006/wordprocessingDrawing" xmlns:w10="urn:schemas-microsoft-com:office:word" xmlns:w="http://schemas.openxmlformats.org/wordprocessingml/2006/main" xmlns:w14="http://schemas.microsoft.com/office/word/2010/wordml" xmlns:w15="http://schemas.microsoft.com/office/word/2012/wordml" xmlns:w16cex="http://schemas.microsoft.com/office/word/2018/wordml/cex" xmlns:w16cid="http://schemas.microsoft.com/office/word/2016/wordml/cid" xmlns:w16="http://schemas.microsoft.com/office/word/2018/wordml" xmlns:w16du="http://schemas.microsoft.com/office/word/2023/wordml/word16du" xmlns:w16sdtdh="http://schemas.microsoft.com/office/word/2020/wordml/sdtdatahash" xmlns:w16sdtfl="http://schemas.microsoft.com/office/word/2024/wordml/sdtformatlock" xmlns:w16se="http://schemas.microsoft.com/office/word/2015/wordml/symex" xmlns:wpg="http://schemas.microsoft.com/office/word/2010/wordprocessingGroup" xmlns:wpi="http://schemas.microsoft.com/office/word/2010/wordprocessingInk" xmlns:wne="http://schemas.microsoft.com/office/word/2006/wordml" xmlns:wps="http://schemas.microsoft.com/office/word/2010/wordprocessingShape" mc:Ignorable="w14 w15 w16se w16cid w16 w16cex w16sdtdh w16sdtfl w16du wp14">
   <w:body>
     <w:p>
       <w:pPr>
@@ -161,23 +161,7 @@
                 <w:noProof/>
                 <w:lang w:val="es-ES"/>
               </w:rPr>
-              <w:t>Pró</w:t>
-            </w:r>
-            <w:r>
-              <w:rPr>
-                <w:rStyle w:val="Hipervnculo"/>
-                <w:noProof/>
-                <w:lang w:val="es-ES"/>
-              </w:rPr>
-              <w:t>l</w:t>
-            </w:r>
-            <w:r>
-              <w:rPr>
-                <w:rStyle w:val="Hipervnculo"/>
-                <w:noProof/>
-                <w:lang w:val="es-ES"/>
-              </w:rPr>
-              <w:t>ogo</w:t>
+              <w:t>Prólogo</w:t>
             </w:r>
             <w:r>
               <w:rPr>
@@ -1165,13 +1149,7 @@
           <w:lang w:val="es-ES"/>
         </w:rPr>
         <w:lastRenderedPageBreak/>
-        <w:t>L</w:t>
-      </w:r>
-      <w:r>
-        <w:rPr>
-          <w:lang w:val="es-ES"/>
-        </w:rPr>
-        <w:t>a cámara de gravedad</w:t>
+        <w:t>La cámara de gravedad</w:t>
       </w:r>
       <w:r>
         <w:rPr>
@@ -1502,13 +1480,7 @@
         <w:rPr>
           <w:lang w:val="es-ES"/>
         </w:rPr>
-        <w:t xml:space="preserve">: </w:t>
-      </w:r>
-      <w:r>
-        <w:rPr>
-          <w:lang w:val="es-ES"/>
-        </w:rPr>
-        <w:t>obligatorios y redactados exclusivamente en inglés</w:t>
+        <w:t>: obligatorios y redactados exclusivamente en inglés</w:t>
       </w:r>
       <w:r>
         <w:rPr>
@@ -1981,40 +1953,23 @@
           <w:ilvl w:val="0"/>
           <w:numId w:val="12"/>
         </w:numPr>
-      </w:pPr>
-      <w:r>
-        <w:rPr>
-          <w:b/>
-          <w:bCs/>
+        <w:rPr>
+          <w:lang w:val="es-ES"/>
+        </w:rPr>
+      </w:pPr>
+      <w:r>
+        <w:rPr>
+          <w:b/>
+          <w:bCs/>
+          <w:lang w:val="es-ES"/>
         </w:rPr>
         <w:t>-Co:</w:t>
       </w:r>
       <w:r>
-        <w:t xml:space="preserve"> </w:t>
-      </w:r>
-      <w:proofErr w:type="spellStart"/>
-      <w:r>
-        <w:t>comprobación</w:t>
-      </w:r>
-      <w:proofErr w:type="spellEnd"/>
-      <w:r>
-        <w:t xml:space="preserve"> de </w:t>
-      </w:r>
-      <w:proofErr w:type="spellStart"/>
-      <w:r>
-        <w:t>desbordamiento</w:t>
-      </w:r>
-      <w:proofErr w:type="spellEnd"/>
-      <w:r>
-        <w:t xml:space="preserve"> de </w:t>
-      </w:r>
-      <w:proofErr w:type="spellStart"/>
-      <w:r>
-        <w:t>enteros</w:t>
-      </w:r>
-      <w:proofErr w:type="spellEnd"/>
-      <w:r>
-        <w:t>.</w:t>
+        <w:rPr>
+          <w:lang w:val="es-ES"/>
+        </w:rPr>
+        <w:t xml:space="preserve"> comprobación de desbordamiento de enteros.</w:t>
       </w:r>
     </w:p>
     <w:p>
@@ -2024,40 +1979,37 @@
           <w:ilvl w:val="0"/>
           <w:numId w:val="12"/>
         </w:numPr>
-      </w:pPr>
-      <w:r>
-        <w:rPr>
-          <w:b/>
-          <w:bCs/>
+        <w:rPr>
+          <w:lang w:val="es-ES"/>
+        </w:rPr>
+      </w:pPr>
+      <w:r>
+        <w:rPr>
+          <w:b/>
+          <w:bCs/>
+          <w:lang w:val="es-ES"/>
         </w:rPr>
         <w:t>-Cr:</w:t>
       </w:r>
       <w:r>
-        <w:t xml:space="preserve"> </w:t>
-      </w:r>
-      <w:proofErr w:type="spellStart"/>
-      <w:r>
-        <w:t>comprobación</w:t>
-      </w:r>
-      <w:proofErr w:type="spellEnd"/>
-      <w:r>
-        <w:t xml:space="preserve"> de </w:t>
-      </w:r>
-      <w:proofErr w:type="spellStart"/>
-      <w:r>
-        <w:t>límites</w:t>
-      </w:r>
-      <w:proofErr w:type="spellEnd"/>
-      <w:r>
-        <w:t xml:space="preserve"> de arrays y </w:t>
-      </w:r>
-      <w:proofErr w:type="spellStart"/>
-      <w:r>
-        <w:t>rangos</w:t>
-      </w:r>
-      <w:proofErr w:type="spellEnd"/>
-      <w:r>
-        <w:t>.</w:t>
+        <w:rPr>
+          <w:lang w:val="es-ES"/>
+        </w:rPr>
+        <w:t xml:space="preserve"> comprobación de límites de </w:t>
+      </w:r>
+      <w:proofErr w:type="spellStart"/>
+      <w:r>
+        <w:rPr>
+          <w:lang w:val="es-ES"/>
+        </w:rPr>
+        <w:t>arrays</w:t>
+      </w:r>
+      <w:proofErr w:type="spellEnd"/>
+      <w:r>
+        <w:rPr>
+          <w:lang w:val="es-ES"/>
+        </w:rPr>
+        <w:t xml:space="preserve"> y rangos.</w:t>
       </w:r>
     </w:p>
     <w:p>
@@ -2067,11 +2019,15 @@
           <w:ilvl w:val="0"/>
           <w:numId w:val="12"/>
         </w:numPr>
-      </w:pPr>
-      <w:r>
-        <w:rPr>
-          <w:b/>
-          <w:bCs/>
+        <w:rPr>
+          <w:lang w:val="es-ES"/>
+        </w:rPr>
+      </w:pPr>
+      <w:r>
+        <w:rPr>
+          <w:b/>
+          <w:bCs/>
+          <w:lang w:val="es-ES"/>
         </w:rPr>
         <w:t>-</w:t>
       </w:r>
@@ -2080,6 +2036,7 @@
         <w:rPr>
           <w:b/>
           <w:bCs/>
+          <w:lang w:val="es-ES"/>
         </w:rPr>
         <w:t>Mobjfpc</w:t>
       </w:r>
@@ -2088,27 +2045,15 @@
         <w:rPr>
           <w:b/>
           <w:bCs/>
+          <w:lang w:val="es-ES"/>
         </w:rPr>
         <w:t>:</w:t>
       </w:r>
       <w:r>
-        <w:t xml:space="preserve"> </w:t>
-      </w:r>
-      <w:proofErr w:type="spellStart"/>
-      <w:r>
-        <w:t>sintaxis</w:t>
-      </w:r>
-      <w:proofErr w:type="spellEnd"/>
-      <w:r>
-        <w:t xml:space="preserve"> moderna </w:t>
-      </w:r>
-      <w:proofErr w:type="spellStart"/>
-      <w:r>
-        <w:t>estándar</w:t>
-      </w:r>
-      <w:proofErr w:type="spellEnd"/>
-      <w:r>
-        <w:t xml:space="preserve"> de </w:t>
+        <w:rPr>
+          <w:lang w:val="es-ES"/>
+        </w:rPr>
+        <w:t xml:space="preserve"> sintaxis moderna estándar de </w:t>
       </w:r>
       <w:r>
         <w:rPr>
@@ -2116,16 +2061,23 @@
           <w:bCs/>
           <w:i/>
           <w:iCs/>
+          <w:lang w:val="es-ES"/>
         </w:rPr>
         <w:t>Free Pascal</w:t>
       </w:r>
       <w:r>
+        <w:rPr>
+          <w:lang w:val="es-ES"/>
+        </w:rPr>
         <w:t>.</w:t>
       </w:r>
     </w:p>
     <w:p>
       <w:pPr>
         <w:pStyle w:val="Sinespaciado"/>
+        <w:rPr>
+          <w:lang w:val="es-ES"/>
+        </w:rPr>
       </w:pPr>
     </w:p>
     <w:p>
@@ -2219,6 +2171,9 @@
     <w:p>
       <w:pPr>
         <w:pStyle w:val="Sinespaciado"/>
+        <w:rPr>
+          <w:lang w:val="es-ES"/>
+        </w:rPr>
       </w:pPr>
     </w:p>
     <w:p>
@@ -2580,6 +2535,9 @@
     <w:p>
       <w:pPr>
         <w:pStyle w:val="Sinespaciado"/>
+        <w:rPr>
+          <w:lang w:val="es-ES"/>
+        </w:rPr>
       </w:pPr>
     </w:p>
     <w:p>
@@ -2778,6 +2736,7 @@
       </w:pPr>
       <w:r>
         <w:rPr>
+          <w:noProof/>
           <w:lang w:val="es-ES"/>
         </w:rPr>
         <w:drawing>
@@ -3441,7 +3400,7 @@
               </wp:inline>
             </w:drawing>
           </mc:Choice>
-          <mc:Fallback>
+          <mc:Fallback xmlns:w16cei="http://schemas.microsoft.com/office/word/2026/wordml/cei">
             <w:pict>
               <v:rect w14:anchorId="57FCD2AB" id="Rectángulo 3" o:spid="_x0000_s1026" alt="Aquaman | Character Profile Wikia | Fandom" style="width:24pt;height:24pt;visibility:visible;mso-wrap-style:square;mso-left-percent:-10001;mso-top-percent:-10001;mso-position-horizontal:absolute;mso-position-horizontal-relative:char;mso-position-vertical:absolute;mso-position-vertical-relative:line;mso-left-percent:-10001;mso-top-percent:-10001;v-text-anchor:top" o:gfxdata="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" filled="f" stroked="f">
                 <o:lock v:ext="edit" aspectratio="t"/>
@@ -7739,6 +7698,586 @@
     </w:p>
     <w:p>
       <w:pPr>
+        <w:pStyle w:val="Ttulo3"/>
+        <w:pageBreakBefore/>
+        <w:numPr>
+          <w:ilvl w:val="0"/>
+          <w:numId w:val="6"/>
+        </w:numPr>
+        <w:tabs>
+          <w:tab w:val="num" w:pos="720"/>
+        </w:tabs>
+        <w:rPr>
+          <w:bCs/>
+          <w:lang w:val="es-ES"/>
+        </w:rPr>
+      </w:pPr>
+      <w:r>
+        <w:rPr>
+          <w:lang w:val="es-ES"/>
+        </w:rPr>
+        <w:lastRenderedPageBreak/>
+        <w:t>Ejercicio</w:t>
+      </w:r>
+      <w:r>
+        <w:rPr>
+          <w:lang w:val="es-ES"/>
+        </w:rPr>
+        <w:t xml:space="preserve"> </w:t>
+      </w:r>
+      <w:r>
+        <w:rPr>
+          <w:bCs/>
+          <w:lang w:val="es-ES"/>
+        </w:rPr>
+        <w:t>0</w:t>
+      </w:r>
+      <w:r>
+        <w:rPr>
+          <w:bCs/>
+          <w:lang w:val="es-ES"/>
+        </w:rPr>
+        <w:t>7</w:t>
+      </w:r>
+      <w:r>
+        <w:rPr>
+          <w:bCs/>
+          <w:lang w:val="es-ES"/>
+        </w:rPr>
+        <w:t xml:space="preserve">: </w:t>
+      </w:r>
+      <w:r>
+        <w:rPr>
+          <w:bCs/>
+          <w:lang w:val="es-ES"/>
+        </w:rPr>
+        <w:t xml:space="preserve">Rango de Detección del </w:t>
+      </w:r>
+      <w:proofErr w:type="spellStart"/>
+      <w:r>
+        <w:rPr>
+          <w:bCs/>
+          <w:lang w:val="es-ES"/>
+        </w:rPr>
+        <w:t>Scouter</w:t>
+      </w:r>
+      <w:proofErr w:type="spellEnd"/>
+      <w:r>
+        <w:rPr>
+          <w:bCs/>
+          <w:lang w:val="es-ES"/>
+        </w:rPr>
+        <w:t xml:space="preserve"> (Constantes y Precedencia)</w:t>
+      </w:r>
+    </w:p>
+    <w:p>
+      <w:pPr>
+        <w:pStyle w:val="Sinespaciado"/>
+        <w:numPr>
+          <w:ilvl w:val="0"/>
+          <w:numId w:val="3"/>
+        </w:numPr>
+        <w:rPr>
+          <w:lang w:val="es-ES"/>
+        </w:rPr>
+      </w:pPr>
+      <w:r>
+        <w:rPr>
+          <w:b/>
+          <w:bCs/>
+          <w:lang w:val="es-ES"/>
+        </w:rPr>
+        <w:t>Directorio</w:t>
+      </w:r>
+      <w:r>
+        <w:rPr>
+          <w:lang w:val="es-ES"/>
+        </w:rPr>
+        <w:t xml:space="preserve">: </w:t>
+      </w:r>
+      <w:r>
+        <w:t>ex0</w:t>
+      </w:r>
+      <w:r>
+        <w:t>7</w:t>
+      </w:r>
+      <w:r>
+        <w:rPr>
+          <w:lang w:val="es-ES"/>
+        </w:rPr>
+        <w:t>/</w:t>
+      </w:r>
+    </w:p>
+    <w:p>
+      <w:pPr>
+        <w:pStyle w:val="Sinespaciado"/>
+        <w:numPr>
+          <w:ilvl w:val="0"/>
+          <w:numId w:val="4"/>
+        </w:numPr>
+      </w:pPr>
+      <w:proofErr w:type="spellStart"/>
+      <w:r>
+        <w:rPr>
+          <w:b/>
+          <w:bCs/>
+        </w:rPr>
+        <w:t>Archivo</w:t>
+      </w:r>
+      <w:proofErr w:type="spellEnd"/>
+      <w:r>
+        <w:t xml:space="preserve">: </w:t>
+      </w:r>
+      <w:proofErr w:type="spellStart"/>
+      <w:r>
+        <w:t>scouter_range.pas</w:t>
+      </w:r>
+      <w:proofErr w:type="spellEnd"/>
+    </w:p>
+    <w:p>
+      <w:pPr>
+        <w:pStyle w:val="Sinespaciado"/>
+        <w:numPr>
+          <w:ilvl w:val="0"/>
+          <w:numId w:val="4"/>
+        </w:numPr>
+        <w:rPr>
+          <w:lang w:val="es-ES"/>
+        </w:rPr>
+      </w:pPr>
+      <w:r>
+        <w:rPr>
+          <w:b/>
+          <w:bCs/>
+          <w:lang w:val="es-ES"/>
+        </w:rPr>
+        <w:t>Funciones autorizadas</w:t>
+      </w:r>
+      <w:r>
+        <w:rPr>
+          <w:lang w:val="es-ES"/>
+        </w:rPr>
+        <w:t xml:space="preserve">: </w:t>
+      </w:r>
+      <w:proofErr w:type="spellStart"/>
+      <w:r>
+        <w:t>readln</w:t>
+      </w:r>
+      <w:proofErr w:type="spellEnd"/>
+      <w:r>
+        <w:t xml:space="preserve">, </w:t>
+      </w:r>
+      <w:proofErr w:type="spellStart"/>
+      <w:r>
+        <w:t>writeln</w:t>
+      </w:r>
+      <w:proofErr w:type="spellEnd"/>
+    </w:p>
+    <w:p>
+      <w:pPr>
+        <w:pStyle w:val="Sinespaciado"/>
+        <w:rPr>
+          <w:b/>
+          <w:bCs/>
+          <w:lang w:val="es-ES"/>
+        </w:rPr>
+      </w:pPr>
+    </w:p>
+    <w:p>
+      <w:pPr>
+        <w:pStyle w:val="Sinespaciado"/>
+        <w:rPr>
+          <w:b/>
+          <w:bCs/>
+          <w:lang w:val="es-ES"/>
+        </w:rPr>
+      </w:pPr>
+      <w:r>
+        <w:rPr>
+          <w:b/>
+          <w:bCs/>
+          <w:lang w:val="es-ES"/>
+        </w:rPr>
+        <w:t>Concepto clave</w:t>
+      </w:r>
+      <w:r>
+        <w:rPr>
+          <w:b/>
+          <w:bCs/>
+          <w:lang w:val="es-ES"/>
+        </w:rPr>
+        <w:t xml:space="preserve">: </w:t>
+      </w:r>
+      <w:r>
+        <w:rPr>
+          <w:lang w:val="es-ES"/>
+        </w:rPr>
+        <w:t xml:space="preserve">Declaración obligatoria de constantes en la sección </w:t>
+      </w:r>
+      <w:proofErr w:type="spellStart"/>
+      <w:r>
+        <w:rPr>
+          <w:lang w:val="es-ES"/>
+        </w:rPr>
+        <w:t>const</w:t>
+      </w:r>
+      <w:proofErr w:type="spellEnd"/>
+      <w:r>
+        <w:rPr>
+          <w:lang w:val="es-ES"/>
+        </w:rPr>
+        <w:t xml:space="preserve"> y uso estricto de paréntesis en expresiones booleanas compuestas.</w:t>
+      </w:r>
+    </w:p>
+    <w:p>
+      <w:pPr>
+        <w:pStyle w:val="Sinespaciado"/>
+        <w:rPr>
+          <w:b/>
+          <w:bCs/>
+          <w:lang w:val="es-ES"/>
+        </w:rPr>
+      </w:pPr>
+    </w:p>
+    <w:p>
+      <w:pPr>
+        <w:pStyle w:val="Sinespaciado"/>
+        <w:rPr>
+          <w:lang w:val="es-ES"/>
+        </w:rPr>
+      </w:pPr>
+      <w:r>
+        <w:rPr>
+          <w:b/>
+          <w:bCs/>
+          <w:lang w:val="es-ES"/>
+        </w:rPr>
+        <w:t xml:space="preserve">Objetivo: </w:t>
+      </w:r>
+      <w:r>
+        <w:rPr>
+          <w:lang w:val="es-ES"/>
+        </w:rPr>
+        <w:t xml:space="preserve">Declarar dos constantes: MIN_KI = 500 y MAX_KI = 8500. El programa solicita el </w:t>
+      </w:r>
+      <w:proofErr w:type="spellStart"/>
+      <w:r>
+        <w:rPr>
+          <w:lang w:val="es-ES"/>
+        </w:rPr>
+        <w:t>ki</w:t>
+      </w:r>
+      <w:proofErr w:type="spellEnd"/>
+      <w:r>
+        <w:rPr>
+          <w:lang w:val="es-ES"/>
+        </w:rPr>
+        <w:t xml:space="preserve"> de un guerrero (</w:t>
+      </w:r>
+      <w:proofErr w:type="spellStart"/>
+      <w:r>
+        <w:rPr>
+          <w:lang w:val="es-ES"/>
+        </w:rPr>
+        <w:t>Integer</w:t>
+      </w:r>
+      <w:proofErr w:type="spellEnd"/>
+      <w:r>
+        <w:rPr>
+          <w:lang w:val="es-ES"/>
+        </w:rPr>
+        <w:t xml:space="preserve">) y debe evaluar en una variable booleana si el valor se encuentra </w:t>
+      </w:r>
+      <w:r>
+        <w:rPr>
+          <w:b/>
+          <w:bCs/>
+          <w:lang w:val="es-ES"/>
+        </w:rPr>
+        <w:t>dentro del rango medible</w:t>
+      </w:r>
+      <w:r>
+        <w:rPr>
+          <w:lang w:val="es-ES"/>
+        </w:rPr>
+        <w:t xml:space="preserve"> (ambos límites inclusive) usando and.</w:t>
+      </w:r>
+    </w:p>
+    <w:p>
+      <w:pPr>
+        <w:pStyle w:val="Sinespaciado"/>
+        <w:rPr>
+          <w:b/>
+          <w:bCs/>
+          <w:lang w:val="es-ES"/>
+        </w:rPr>
+      </w:pPr>
+    </w:p>
+    <w:p>
+      <w:pPr>
+        <w:pStyle w:val="Sinespaciado"/>
+        <w:rPr>
+          <w:b/>
+          <w:bCs/>
+          <w:lang w:val="es-ES"/>
+        </w:rPr>
+      </w:pPr>
+      <w:r>
+        <w:rPr>
+          <w:b/>
+          <w:bCs/>
+          <w:lang w:val="es-ES"/>
+        </w:rPr>
+        <w:t>Salida Esperada</w:t>
+      </w:r>
+    </w:p>
+    <w:p>
+      <w:pPr>
+        <w:pStyle w:val="Sinespaciado"/>
+        <w:rPr>
+          <w:lang w:val="es-ES"/>
+        </w:rPr>
+      </w:pPr>
+      <w:r>
+        <w:rPr>
+          <w:noProof/>
+          <w:lang w:val="es-ES"/>
+        </w:rPr>
+        <mc:AlternateContent>
+          <mc:Choice Requires="wps">
+            <w:drawing>
+              <wp:anchor distT="0" distB="0" distL="114300" distR="114300" simplePos="0" relativeHeight="251684864" behindDoc="0" locked="0" layoutInCell="1" allowOverlap="1" wp14:anchorId="46A20074" wp14:editId="2AFFC7B8">
+                <wp:simplePos x="0" y="0"/>
+                <wp:positionH relativeFrom="margin">
+                  <wp:align>left</wp:align>
+                </wp:positionH>
+                <wp:positionV relativeFrom="paragraph">
+                  <wp:posOffset>111125</wp:posOffset>
+                </wp:positionV>
+                <wp:extent cx="6124575" cy="1138686"/>
+                <wp:effectExtent l="0" t="0" r="28575" b="23495"/>
+                <wp:wrapNone/>
+                <wp:docPr id="1820171939" name="Rectángulo 2"/>
+                <wp:cNvGraphicFramePr/>
+                <a:graphic xmlns:a="http://schemas.openxmlformats.org/drawingml/2006/main">
+                  <a:graphicData uri="http://schemas.microsoft.com/office/word/2010/wordprocessingShape">
+                    <wps:wsp>
+                      <wps:cNvSpPr/>
+                      <wps:spPr>
+                        <a:xfrm>
+                          <a:off x="0" y="0"/>
+                          <a:ext cx="6124575" cy="1138686"/>
+                        </a:xfrm>
+                        <a:prstGeom prst="rect">
+                          <a:avLst/>
+                        </a:prstGeom>
+                        <a:solidFill>
+                          <a:schemeClr val="tx1"/>
+                        </a:solidFill>
+                        <a:ln>
+                          <a:solidFill>
+                            <a:schemeClr val="tx1"/>
+                          </a:solidFill>
+                        </a:ln>
+                      </wps:spPr>
+                      <wps:style>
+                        <a:lnRef idx="2">
+                          <a:schemeClr val="accent1">
+                            <a:shade val="15000"/>
+                          </a:schemeClr>
+                        </a:lnRef>
+                        <a:fillRef idx="1">
+                          <a:schemeClr val="accent1"/>
+                        </a:fillRef>
+                        <a:effectRef idx="0">
+                          <a:schemeClr val="accent1"/>
+                        </a:effectRef>
+                        <a:fontRef idx="minor">
+                          <a:schemeClr val="lt1"/>
+                        </a:fontRef>
+                      </wps:style>
+                      <wps:txbx>
+                        <w:txbxContent>
+                          <w:p>
+                            <w:pPr>
+                              <w:pStyle w:val="Sinespaciado"/>
+                              <w:rPr>
+                                <w:rFonts w:ascii="Cascadia Mono SemiBold" w:hAnsi="Cascadia Mono SemiBold" w:cs="Cascadia Mono SemiBold"/>
+                              </w:rPr>
+                            </w:pPr>
+                            <w:r>
+                              <w:rPr>
+                                <w:rFonts w:ascii="Cascadia Mono SemiBold" w:hAnsi="Cascadia Mono SemiBold" w:cs="Cascadia Mono SemiBold"/>
+                              </w:rPr>
+                              <w:t>Enter target Ki: 1200</w:t>
+                            </w:r>
+                          </w:p>
+                          <w:p>
+                            <w:pPr>
+                              <w:pStyle w:val="Sinespaciado"/>
+                              <w:rPr>
+                                <w:rFonts w:ascii="Cascadia Mono SemiBold" w:hAnsi="Cascadia Mono SemiBold" w:cs="Cascadia Mono SemiBold"/>
+                              </w:rPr>
+                            </w:pPr>
+                            <w:r>
+                              <w:rPr>
+                                <w:rFonts w:ascii="Cascadia Mono SemiBold" w:hAnsi="Cascadia Mono SemiBold" w:cs="Cascadia Mono SemiBold"/>
+                              </w:rPr>
+                              <w:t>Target in scouter range: TRUE</w:t>
+                            </w:r>
+                          </w:p>
+                          <w:p>
+                            <w:pPr>
+                              <w:pStyle w:val="Sinespaciado"/>
+                              <w:rPr>
+                                <w:rFonts w:ascii="Cascadia Mono SemiBold" w:hAnsi="Cascadia Mono SemiBold" w:cs="Cascadia Mono SemiBold"/>
+                              </w:rPr>
+                            </w:pPr>
+                          </w:p>
+                          <w:p>
+                            <w:pPr>
+                              <w:pStyle w:val="Sinespaciado"/>
+                              <w:rPr>
+                                <w:rFonts w:ascii="Cascadia Mono SemiBold" w:hAnsi="Cascadia Mono SemiBold" w:cs="Cascadia Mono SemiBold"/>
+                              </w:rPr>
+                            </w:pPr>
+                            <w:r>
+                              <w:rPr>
+                                <w:rFonts w:ascii="Cascadia Mono SemiBold" w:hAnsi="Cascadia Mono SemiBold" w:cs="Cascadia Mono SemiBold"/>
+                              </w:rPr>
+                              <w:t>Enter target Ki: 350</w:t>
+                            </w:r>
+                          </w:p>
+                          <w:p>
+                            <w:pPr>
+                              <w:pStyle w:val="Sinespaciado"/>
+                              <w:rPr>
+                                <w:rFonts w:ascii="Cascadia Mono SemiBold" w:hAnsi="Cascadia Mono SemiBold" w:cs="Cascadia Mono SemiBold"/>
+                              </w:rPr>
+                            </w:pPr>
+                            <w:r>
+                              <w:rPr>
+                                <w:rFonts w:ascii="Cascadia Mono SemiBold" w:hAnsi="Cascadia Mono SemiBold" w:cs="Cascadia Mono SemiBold"/>
+                              </w:rPr>
+                              <w:t>Target in scouter range: FALSE</w:t>
+                            </w:r>
+                          </w:p>
+                        </w:txbxContent>
+                      </wps:txbx>
+                      <wps:bodyPr rot="0" spcFirstLastPara="0" vertOverflow="overflow" horzOverflow="overflow" vert="horz" wrap="square" lIns="91440" tIns="45720" rIns="91440" bIns="45720" numCol="1" spcCol="0" rtlCol="0" fromWordArt="0" anchor="ctr" anchorCtr="0" forceAA="0" compatLnSpc="1">
+                        <a:prstTxWarp prst="textNoShape">
+                          <a:avLst/>
+                        </a:prstTxWarp>
+                        <a:noAutofit/>
+                      </wps:bodyPr>
+                    </wps:wsp>
+                  </a:graphicData>
+                </a:graphic>
+                <wp14:sizeRelH relativeFrom="margin">
+                  <wp14:pctWidth>0</wp14:pctWidth>
+                </wp14:sizeRelH>
+                <wp14:sizeRelV relativeFrom="margin">
+                  <wp14:pctHeight>0</wp14:pctHeight>
+                </wp14:sizeRelV>
+              </wp:anchor>
+            </w:drawing>
+          </mc:Choice>
+          <mc:Fallback>
+            <w:pict>
+              <v:rect w14:anchorId="46A20074" id="_x0000_s1033" style="position:absolute;margin-left:0;margin-top:8.75pt;width:482.25pt;height:89.65pt;z-index:251684864;visibility:visible;mso-wrap-style:square;mso-width-percent:0;mso-height-percent:0;mso-wrap-distance-left:9pt;mso-wrap-distance-top:0;mso-wrap-distance-right:9pt;mso-wrap-distance-bottom:0;mso-position-horizontal:left;mso-position-horizontal-relative:margin;mso-position-vertical:absolute;mso-position-vertical-relative:text;mso-width-percent:0;mso-height-percent:0;mso-width-relative:margin;mso-height-relative:margin;v-text-anchor:middle" o:gfxdata="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" fillcolor="black [3213]" strokecolor="black [3213]" strokeweight="1pt">
+                <v:textbox>
+                  <w:txbxContent>
+                    <w:p>
+                      <w:pPr>
+                        <w:pStyle w:val="Sinespaciado"/>
+                        <w:rPr>
+                          <w:rFonts w:ascii="Cascadia Mono SemiBold" w:hAnsi="Cascadia Mono SemiBold" w:cs="Cascadia Mono SemiBold"/>
+                        </w:rPr>
+                      </w:pPr>
+                      <w:r>
+                        <w:rPr>
+                          <w:rFonts w:ascii="Cascadia Mono SemiBold" w:hAnsi="Cascadia Mono SemiBold" w:cs="Cascadia Mono SemiBold"/>
+                        </w:rPr>
+                        <w:t>Enter target Ki: 1200</w:t>
+                      </w:r>
+                    </w:p>
+                    <w:p>
+                      <w:pPr>
+                        <w:pStyle w:val="Sinespaciado"/>
+                        <w:rPr>
+                          <w:rFonts w:ascii="Cascadia Mono SemiBold" w:hAnsi="Cascadia Mono SemiBold" w:cs="Cascadia Mono SemiBold"/>
+                        </w:rPr>
+                      </w:pPr>
+                      <w:r>
+                        <w:rPr>
+                          <w:rFonts w:ascii="Cascadia Mono SemiBold" w:hAnsi="Cascadia Mono SemiBold" w:cs="Cascadia Mono SemiBold"/>
+                        </w:rPr>
+                        <w:t>Target in scouter range: TRUE</w:t>
+                      </w:r>
+                    </w:p>
+                    <w:p>
+                      <w:pPr>
+                        <w:pStyle w:val="Sinespaciado"/>
+                        <w:rPr>
+                          <w:rFonts w:ascii="Cascadia Mono SemiBold" w:hAnsi="Cascadia Mono SemiBold" w:cs="Cascadia Mono SemiBold"/>
+                        </w:rPr>
+                      </w:pPr>
+                    </w:p>
+                    <w:p>
+                      <w:pPr>
+                        <w:pStyle w:val="Sinespaciado"/>
+                        <w:rPr>
+                          <w:rFonts w:ascii="Cascadia Mono SemiBold" w:hAnsi="Cascadia Mono SemiBold" w:cs="Cascadia Mono SemiBold"/>
+                        </w:rPr>
+                      </w:pPr>
+                      <w:r>
+                        <w:rPr>
+                          <w:rFonts w:ascii="Cascadia Mono SemiBold" w:hAnsi="Cascadia Mono SemiBold" w:cs="Cascadia Mono SemiBold"/>
+                        </w:rPr>
+                        <w:t>Enter target Ki: 350</w:t>
+                      </w:r>
+                    </w:p>
+                    <w:p>
+                      <w:pPr>
+                        <w:pStyle w:val="Sinespaciado"/>
+                        <w:rPr>
+                          <w:rFonts w:ascii="Cascadia Mono SemiBold" w:hAnsi="Cascadia Mono SemiBold" w:cs="Cascadia Mono SemiBold"/>
+                        </w:rPr>
+                      </w:pPr>
+                      <w:r>
+                        <w:rPr>
+                          <w:rFonts w:ascii="Cascadia Mono SemiBold" w:hAnsi="Cascadia Mono SemiBold" w:cs="Cascadia Mono SemiBold"/>
+                        </w:rPr>
+                        <w:t>Target in scouter range: FALSE</w:t>
+                      </w:r>
+                    </w:p>
+                  </w:txbxContent>
+                </v:textbox>
+                <w10:wrap anchorx="margin"/>
+              </v:rect>
+            </w:pict>
+          </mc:Fallback>
+        </mc:AlternateContent>
+      </w:r>
+    </w:p>
+    <w:p>
+      <w:pPr>
+        <w:pStyle w:val="Sinespaciado"/>
+        <w:rPr>
+          <w:lang w:val="es-ES"/>
+        </w:rPr>
+      </w:pPr>
+    </w:p>
+    <w:p>
+      <w:pPr>
+        <w:pStyle w:val="Sinespaciado"/>
+        <w:rPr>
+          <w:lang w:val="es-ES"/>
+        </w:rPr>
+      </w:pPr>
+    </w:p>
+    <w:p>
+      <w:pPr>
         <w:rPr>
           <w:lang w:val="es-ES"/>
         </w:rPr>
@@ -7791,7 +8330,7 @@
 </file>
 
 <file path=word/endnotes.xml><?xml version="1.0" encoding="utf-8"?>
-<w:endnotes xmlns:wpc="http://schemas.microsoft.com/office/word/2010/wordprocessingCanvas" xmlns:cx="http://schemas.microsoft.com/office/drawing/2014/chartex" xmlns:cx1="http://schemas.microsoft.com/office/drawing/2015/9/8/chartex" xmlns:cx2="http://schemas.microsoft.com/office/drawing/2015/10/21/chartex" xmlns:cx3="http://schemas.microsoft.com/office/drawing/2016/5/9/chartex" xmlns:cx4="http://schemas.microsoft.com/office/drawing/2016/5/10/chartex" xmlns:cx5="http://schemas.microsoft.com/office/drawing/2016/5/11/chartex" xmlns:cx6="http://schemas.microsoft.com/office/drawing/2016/5/12/chartex" xmlns:cx7="http://schemas.microsoft.com/office/drawing/2016/5/13/chartex" xmlns:cx8="http://schemas.microsoft.com/office/drawing/2016/5/14/chartex" xmlns:mc="http://schemas.openxmlformats.org/markup-compatibility/2006" xmlns:aink="http://schemas.microsoft.com/office/drawing/2016/ink" xmlns:am3d="http://schemas.microsoft.com/office/drawing/2017/model3d" xmlns:o="urn:schemas-microsoft-com:office:office" xmlns:oel="http://schemas.microsoft.com/office/2019/extlst" xmlns:r="http://schemas.openxmlformats.org/officeDocument/2006/relationships" xmlns:m="http://schemas.openxmlformats.org/officeDocument/2006/math" xmlns:v="urn:schemas-microsoft-com:vml" xmlns:wp14="http://schemas.microsoft.com/office/word/2010/wordprocessingDrawing" xmlns:wp="http://schemas.openxmlformats.org/drawingml/2006/wordprocessingDrawing" xmlns:w10="urn:schemas-microsoft-com:office:word" xmlns:w="http://schemas.openxmlformats.org/wordprocessingml/2006/main" xmlns:w14="http://schemas.microsoft.com/office/word/2010/wordml" xmlns:w15="http://schemas.microsoft.com/office/word/2012/wordml" xmlns:w16cei="http://schemas.microsoft.com/office/word/2026/wordml/cei" xmlns:w16cex="http://schemas.microsoft.com/office/word/2018/wordml/cex" xmlns:w16cid="http://schemas.microsoft.com/office/word/2016/wordml/cid" xmlns:w16="http://schemas.microsoft.com/office/word/2018/wordml" xmlns:w16du="http://schemas.microsoft.com/office/word/2023/wordml/word16du" xmlns:w16sdtdh="http://schemas.microsoft.com/office/word/2020/wordml/sdtdatahash" xmlns:w16sdtfl="http://schemas.microsoft.com/office/word/2024/wordml/sdtformatlock" xmlns:w16se="http://schemas.microsoft.com/office/word/2015/wordml/symex" xmlns:wpg="http://schemas.microsoft.com/office/word/2010/wordprocessingGroup" xmlns:wpi="http://schemas.microsoft.com/office/word/2010/wordprocessingInk" xmlns:wne="http://schemas.microsoft.com/office/word/2006/wordml" xmlns:wps="http://schemas.microsoft.com/office/word/2010/wordprocessingShape" mc:Ignorable="w14 w15 w16se w16cid w16 w16cex w16sdtdh w16sdtfl w16du wp14">
+<w:endnotes xmlns:wpc="http://schemas.microsoft.com/office/word/2010/wordprocessingCanvas" xmlns:cx="http://schemas.microsoft.com/office/drawing/2014/chartex" xmlns:cx1="http://schemas.microsoft.com/office/drawing/2015/9/8/chartex" xmlns:cx2="http://schemas.microsoft.com/office/drawing/2015/10/21/chartex" xmlns:cx3="http://schemas.microsoft.com/office/drawing/2016/5/9/chartex" xmlns:cx4="http://schemas.microsoft.com/office/drawing/2016/5/10/chartex" xmlns:cx5="http://schemas.microsoft.com/office/drawing/2016/5/11/chartex" xmlns:cx6="http://schemas.microsoft.com/office/drawing/2016/5/12/chartex" xmlns:cx7="http://schemas.microsoft.com/office/drawing/2016/5/13/chartex" xmlns:cx8="http://schemas.microsoft.com/office/drawing/2016/5/14/chartex" xmlns:mc="http://schemas.openxmlformats.org/markup-compatibility/2006" xmlns:aink="http://schemas.microsoft.com/office/drawing/2016/ink" xmlns:am3d="http://schemas.microsoft.com/office/drawing/2017/model3d" xmlns:o="urn:schemas-microsoft-com:office:office" xmlns:oel="http://schemas.microsoft.com/office/2019/extlst" xmlns:r="http://schemas.openxmlformats.org/officeDocument/2006/relationships" xmlns:m="http://schemas.openxmlformats.org/officeDocument/2006/math" xmlns:v="urn:schemas-microsoft-com:vml" xmlns:wp14="http://schemas.microsoft.com/office/word/2010/wordprocessingDrawing" xmlns:wp="http://schemas.openxmlformats.org/drawingml/2006/wordprocessingDrawing" xmlns:w10="urn:schemas-microsoft-com:office:word" xmlns:w="http://schemas.openxmlformats.org/wordprocessingml/2006/main" xmlns:w14="http://schemas.microsoft.com/office/word/2010/wordml" xmlns:w15="http://schemas.microsoft.com/office/word/2012/wordml" xmlns:w16cex="http://schemas.microsoft.com/office/word/2018/wordml/cex" xmlns:w16cid="http://schemas.microsoft.com/office/word/2016/wordml/cid" xmlns:w16="http://schemas.microsoft.com/office/word/2018/wordml" xmlns:w16du="http://schemas.microsoft.com/office/word/2023/wordml/word16du" xmlns:w16sdtdh="http://schemas.microsoft.com/office/word/2020/wordml/sdtdatahash" xmlns:w16sdtfl="http://schemas.microsoft.com/office/word/2024/wordml/sdtformatlock" xmlns:w16se="http://schemas.microsoft.com/office/word/2015/wordml/symex" xmlns:wpg="http://schemas.microsoft.com/office/word/2010/wordprocessingGroup" xmlns:wpi="http://schemas.microsoft.com/office/word/2010/wordprocessingInk" xmlns:wne="http://schemas.microsoft.com/office/word/2006/wordml" xmlns:wps="http://schemas.microsoft.com/office/word/2010/wordprocessingShape" mc:Ignorable="w14 w15 w16se w16cid w16 w16cex w16sdtdh w16sdtfl w16du wp14">
   <w:endnote w:type="separator" w:id="-1">
     <w:p>
       <w:pPr>
@@ -7816,7 +8355,7 @@
 </file>
 
 <file path=word/footer1.xml><?xml version="1.0" encoding="utf-8"?>
-<w:ftr xmlns:wpc="http://schemas.microsoft.com/office/word/2010/wordprocessingCanvas" xmlns:cx="http://schemas.microsoft.com/office/drawing/2014/chartex" xmlns:cx1="http://schemas.microsoft.com/office/drawing/2015/9/8/chartex" xmlns:cx2="http://schemas.microsoft.com/office/drawing/2015/10/21/chartex" xmlns:cx3="http://schemas.microsoft.com/office/drawing/2016/5/9/chartex" xmlns:cx4="http://schemas.microsoft.com/office/drawing/2016/5/10/chartex" xmlns:cx5="http://schemas.microsoft.com/office/drawing/2016/5/11/chartex" xmlns:cx6="http://schemas.microsoft.com/office/drawing/2016/5/12/chartex" xmlns:cx7="http://schemas.microsoft.com/office/drawing/2016/5/13/chartex" xmlns:cx8="http://schemas.microsoft.com/office/drawing/2016/5/14/chartex" xmlns:mc="http://schemas.openxmlformats.org/markup-compatibility/2006" xmlns:aink="http://schemas.microsoft.com/office/drawing/2016/ink" xmlns:am3d="http://schemas.microsoft.com/office/drawing/2017/model3d" xmlns:o="urn:schemas-microsoft-com:office:office" xmlns:oel="http://schemas.microsoft.com/office/2019/extlst" xmlns:r="http://schemas.openxmlformats.org/officeDocument/2006/relationships" xmlns:m="http://schemas.openxmlformats.org/officeDocument/2006/math" xmlns:v="urn:schemas-microsoft-com:vml" xmlns:wp14="http://schemas.microsoft.com/office/word/2010/wordprocessingDrawing" xmlns:wp="http://schemas.openxmlformats.org/drawingml/2006/wordprocessingDrawing" xmlns:w10="urn:schemas-microsoft-com:office:word" xmlns:w="http://schemas.openxmlformats.org/wordprocessingml/2006/main" xmlns:w14="http://schemas.microsoft.com/office/word/2010/wordml" xmlns:w15="http://schemas.microsoft.com/office/word/2012/wordml" xmlns:w16cei="http://schemas.microsoft.com/office/word/2026/wordml/cei" xmlns:w16cex="http://schemas.microsoft.com/office/word/2018/wordml/cex" xmlns:w16cid="http://schemas.microsoft.com/office/word/2016/wordml/cid" xmlns:w16="http://schemas.microsoft.com/office/word/2018/wordml" xmlns:w16du="http://schemas.microsoft.com/office/word/2023/wordml/word16du" xmlns:w16sdtdh="http://schemas.microsoft.com/office/word/2020/wordml/sdtdatahash" xmlns:w16sdtfl="http://schemas.microsoft.com/office/word/2024/wordml/sdtformatlock" xmlns:w16se="http://schemas.microsoft.com/office/word/2015/wordml/symex" xmlns:wpg="http://schemas.microsoft.com/office/word/2010/wordprocessingGroup" xmlns:wpi="http://schemas.microsoft.com/office/word/2010/wordprocessingInk" xmlns:wne="http://schemas.microsoft.com/office/word/2006/wordml" xmlns:wps="http://schemas.microsoft.com/office/word/2010/wordprocessingShape" mc:Ignorable="w14 w15 w16se w16cid w16 w16cex w16sdtdh w16sdtfl w16du wp14">
+<w:ftr xmlns:wpc="http://schemas.microsoft.com/office/word/2010/wordprocessingCanvas" xmlns:cx="http://schemas.microsoft.com/office/drawing/2014/chartex" xmlns:cx1="http://schemas.microsoft.com/office/drawing/2015/9/8/chartex" xmlns:cx2="http://schemas.microsoft.com/office/drawing/2015/10/21/chartex" xmlns:cx3="http://schemas.microsoft.com/office/drawing/2016/5/9/chartex" xmlns:cx4="http://schemas.microsoft.com/office/drawing/2016/5/10/chartex" xmlns:cx5="http://schemas.microsoft.com/office/drawing/2016/5/11/chartex" xmlns:cx6="http://schemas.microsoft.com/office/drawing/2016/5/12/chartex" xmlns:cx7="http://schemas.microsoft.com/office/drawing/2016/5/13/chartex" xmlns:cx8="http://schemas.microsoft.com/office/drawing/2016/5/14/chartex" xmlns:mc="http://schemas.openxmlformats.org/markup-compatibility/2006" xmlns:aink="http://schemas.microsoft.com/office/drawing/2016/ink" xmlns:am3d="http://schemas.microsoft.com/office/drawing/2017/model3d" xmlns:o="urn:schemas-microsoft-com:office:office" xmlns:oel="http://schemas.microsoft.com/office/2019/extlst" xmlns:r="http://schemas.openxmlformats.org/officeDocument/2006/relationships" xmlns:m="http://schemas.openxmlformats.org/officeDocument/2006/math" xmlns:v="urn:schemas-microsoft-com:vml" xmlns:wp14="http://schemas.microsoft.com/office/word/2010/wordprocessingDrawing" xmlns:wp="http://schemas.openxmlformats.org/drawingml/2006/wordprocessingDrawing" xmlns:w10="urn:schemas-microsoft-com:office:word" xmlns:w="http://schemas.openxmlformats.org/wordprocessingml/2006/main" xmlns:w14="http://schemas.microsoft.com/office/word/2010/wordml" xmlns:w15="http://schemas.microsoft.com/office/word/2012/wordml" xmlns:w16cex="http://schemas.microsoft.com/office/word/2018/wordml/cex" xmlns:w16cid="http://schemas.microsoft.com/office/word/2016/wordml/cid" xmlns:w16="http://schemas.microsoft.com/office/word/2018/wordml" xmlns:w16du="http://schemas.microsoft.com/office/word/2023/wordml/word16du" xmlns:w16sdtdh="http://schemas.microsoft.com/office/word/2020/wordml/sdtdatahash" xmlns:w16sdtfl="http://schemas.microsoft.com/office/word/2024/wordml/sdtformatlock" xmlns:w16se="http://schemas.microsoft.com/office/word/2015/wordml/symex" xmlns:wpg="http://schemas.microsoft.com/office/word/2010/wordprocessingGroup" xmlns:wpi="http://schemas.microsoft.com/office/word/2010/wordprocessingInk" xmlns:wne="http://schemas.microsoft.com/office/word/2006/wordml" xmlns:wps="http://schemas.microsoft.com/office/word/2010/wordprocessingShape" mc:Ignorable="w14 w15 w16se w16cid w16 w16cex w16sdtdh w16sdtfl w16du wp14">
   <w:p>
     <w:pPr>
       <w:pStyle w:val="Piedepgina"/>
@@ -8002,13 +8541,13 @@
         </mc:Choice>
         <mc:Fallback>
           <w:pict>
-            <v:group w14:anchorId="3F9AEA99" id="Grupo 7" o:spid="_x0000_s1033" style="position:absolute;margin-left:416.8pt;margin-top:0;width:468pt;height:25.2pt;z-index:251660288;mso-width-percent:1000;mso-top-percent:200;mso-wrap-distance-left:0;mso-wrap-distance-right:0;mso-position-horizontal:right;mso-position-horizontal-relative:margin;mso-position-vertical-relative:bottom-margin-area;mso-width-percent:1000;mso-top-percent:200;mso-width-relative:margin;mso-height-relative:margin" coordsize="59626,3238" o:gfxdata="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">
-              <v:rect id="Rectángulo 38" o:spid="_x0000_s1034" style="position:absolute;left:190;width:59436;height:188;visibility:visible;mso-wrap-style:square;v-text-anchor:middle" o:gfxdata="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" fillcolor="black [3213]" stroked="f" strokeweight="1pt"/>
+            <v:group w14:anchorId="3F9AEA99" id="Grupo 7" o:spid="_x0000_s1034" style="position:absolute;margin-left:416.8pt;margin-top:0;width:468pt;height:25.2pt;z-index:251660288;mso-width-percent:1000;mso-top-percent:200;mso-wrap-distance-left:0;mso-wrap-distance-right:0;mso-position-horizontal:right;mso-position-horizontal-relative:margin;mso-position-vertical-relative:bottom-margin-area;mso-width-percent:1000;mso-top-percent:200;mso-width-relative:margin;mso-height-relative:margin" coordsize="59626,3238" o:gfxdata="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">
+              <v:rect id="Rectángulo 38" o:spid="_x0000_s1035" style="position:absolute;left:190;width:59436;height:188;visibility:visible;mso-wrap-style:square;v-text-anchor:middle" o:gfxdata="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" fillcolor="black [3213]" stroked="f" strokeweight="1pt"/>
               <v:shapetype id="_x0000_t202" coordsize="21600,21600" o:spt="202" path="m,l,21600r21600,l21600,xe">
                 <v:stroke joinstyle="miter"/>
                 <v:path gradientshapeok="t" o:connecttype="rect"/>
               </v:shapetype>
-              <v:shape id="Cuadro de texto 39" o:spid="_x0000_s1035" type="#_x0000_t202" style="position:absolute;top:666;width:59436;height:2572;visibility:visible;mso-wrap-style:square;v-text-anchor:bottom" o:gfxdata="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" filled="f" stroked="f" strokeweight=".5pt">
+              <v:shape id="Cuadro de texto 39" o:spid="_x0000_s1036" type="#_x0000_t202" style="position:absolute;top:666;width:59436;height:2572;visibility:visible;mso-wrap-style:square;v-text-anchor:bottom" o:gfxdata="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" filled="f" stroked="f" strokeweight=".5pt">
                 <v:textbox inset=",,,0">
                   <w:txbxContent>
                     <w:sdt>
@@ -8201,7 +8740,7 @@
         </mc:Choice>
         <mc:Fallback>
           <w:pict>
-            <v:rect w14:anchorId="28FF1757" id="Rectángulo 8" o:spid="_x0000_s1036" style="position:absolute;margin-left:0;margin-top:0;width:36pt;height:25.2pt;z-index:251659264;visibility:visible;mso-wrap-style:square;mso-width-percent:0;mso-height-percent:0;mso-top-percent:200;mso-wrap-distance-left:0;mso-wrap-distance-top:0;mso-wrap-distance-right:0;mso-wrap-distance-bottom:0;mso-position-horizontal:left;mso-position-horizontal-relative:right-margin-area;mso-position-vertical-relative:bottom-margin-area;mso-width-percent:0;mso-height-percent:0;mso-top-percent:200;mso-width-relative:margin;mso-height-relative:margin;v-text-anchor:bottom" o:gfxdata="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" fillcolor="black [3213]" stroked="f" strokeweight="3pt">
+            <v:rect w14:anchorId="28FF1757" id="Rectángulo 8" o:spid="_x0000_s1037" style="position:absolute;margin-left:0;margin-top:0;width:36pt;height:25.2pt;z-index:251659264;visibility:visible;mso-wrap-style:square;mso-width-percent:0;mso-height-percent:0;mso-top-percent:200;mso-wrap-distance-left:0;mso-wrap-distance-top:0;mso-wrap-distance-right:0;mso-wrap-distance-bottom:0;mso-position-horizontal:left;mso-position-horizontal-relative:right-margin-area;mso-position-vertical-relative:bottom-margin-area;mso-width-percent:0;mso-height-percent:0;mso-top-percent:200;mso-width-relative:margin;mso-height-relative:margin;v-text-anchor:bottom" o:gfxdata="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" fillcolor="black [3213]" stroked="f" strokeweight="3pt">
               <v:textbox>
                 <w:txbxContent>
                   <w:p>
@@ -8268,7 +8807,7 @@
 </file>
 
 <file path=word/footnotes.xml><?xml version="1.0" encoding="utf-8"?>
-<w:footnotes xmlns:wpc="http://schemas.microsoft.com/office/word/2010/wordprocessingCanvas" xmlns:cx="http://schemas.microsoft.com/office/drawing/2014/chartex" xmlns:cx1="http://schemas.microsoft.com/office/drawing/2015/9/8/chartex" xmlns:cx2="http://schemas.microsoft.com/office/drawing/2015/10/21/chartex" xmlns:cx3="http://schemas.microsoft.com/office/drawing/2016/5/9/chartex" xmlns:cx4="http://schemas.microsoft.com/office/drawing/2016/5/10/chartex" xmlns:cx5="http://schemas.microsoft.com/office/drawing/2016/5/11/chartex" xmlns:cx6="http://schemas.microsoft.com/office/drawing/2016/5/12/chartex" xmlns:cx7="http://schemas.microsoft.com/office/drawing/2016/5/13/chartex" xmlns:cx8="http://schemas.microsoft.com/office/drawing/2016/5/14/chartex" xmlns:mc="http://schemas.openxmlformats.org/markup-compatibility/2006" xmlns:aink="http://schemas.microsoft.com/office/drawing/2016/ink" xmlns:am3d="http://schemas.microsoft.com/office/drawing/2017/model3d" xmlns:o="urn:schemas-microsoft-com:office:office" xmlns:oel="http://schemas.microsoft.com/office/2019/extlst" xmlns:r="http://schemas.openxmlformats.org/officeDocument/2006/relationships" xmlns:m="http://schemas.openxmlformats.org/officeDocument/2006/math" xmlns:v="urn:schemas-microsoft-com:vml" xmlns:wp14="http://schemas.microsoft.com/office/word/2010/wordprocessingDrawing" xmlns:wp="http://schemas.openxmlformats.org/drawingml/2006/wordprocessingDrawing" xmlns:w10="urn:schemas-microsoft-com:office:word" xmlns:w="http://schemas.openxmlformats.org/wordprocessingml/2006/main" xmlns:w14="http://schemas.microsoft.com/office/word/2010/wordml" xmlns:w15="http://schemas.microsoft.com/office/word/2012/wordml" xmlns:w16cei="http://schemas.microsoft.com/office/word/2026/wordml/cei" xmlns:w16cex="http://schemas.microsoft.com/office/word/2018/wordml/cex" xmlns:w16cid="http://schemas.microsoft.com/office/word/2016/wordml/cid" xmlns:w16="http://schemas.microsoft.com/office/word/2018/wordml" xmlns:w16du="http://schemas.microsoft.com/office/word/2023/wordml/word16du" xmlns:w16sdtdh="http://schemas.microsoft.com/office/word/2020/wordml/sdtdatahash" xmlns:w16sdtfl="http://schemas.microsoft.com/office/word/2024/wordml/sdtformatlock" xmlns:w16se="http://schemas.microsoft.com/office/word/2015/wordml/symex" xmlns:wpg="http://schemas.microsoft.com/office/word/2010/wordprocessingGroup" xmlns:wpi="http://schemas.microsoft.com/office/word/2010/wordprocessingInk" xmlns:wne="http://schemas.microsoft.com/office/word/2006/wordml" xmlns:wps="http://schemas.microsoft.com/office/word/2010/wordprocessingShape" mc:Ignorable="w14 w15 w16se w16cid w16 w16cex w16sdtdh w16sdtfl w16du wp14">
+<w:footnotes xmlns:wpc="http://schemas.microsoft.com/office/word/2010/wordprocessingCanvas" xmlns:cx="http://schemas.microsoft.com/office/drawing/2014/chartex" xmlns:cx1="http://schemas.microsoft.com/office/drawing/2015/9/8/chartex" xmlns:cx2="http://schemas.microsoft.com/office/drawing/2015/10/21/chartex" xmlns:cx3="http://schemas.microsoft.com/office/drawing/2016/5/9/chartex" xmlns:cx4="http://schemas.microsoft.com/office/drawing/2016/5/10/chartex" xmlns:cx5="http://schemas.microsoft.com/office/drawing/2016/5/11/chartex" xmlns:cx6="http://schemas.microsoft.com/office/drawing/2016/5/12/chartex" xmlns:cx7="http://schemas.microsoft.com/office/drawing/2016/5/13/chartex" xmlns:cx8="http://schemas.microsoft.com/office/drawing/2016/5/14/chartex" xmlns:mc="http://schemas.openxmlformats.org/markup-compatibility/2006" xmlns:aink="http://schemas.microsoft.com/office/drawing/2016/ink" xmlns:am3d="http://schemas.microsoft.com/office/drawing/2017/model3d" xmlns:o="urn:schemas-microsoft-com:office:office" xmlns:oel="http://schemas.microsoft.com/office/2019/extlst" xmlns:r="http://schemas.openxmlformats.org/officeDocument/2006/relationships" xmlns:m="http://schemas.openxmlformats.org/officeDocument/2006/math" xmlns:v="urn:schemas-microsoft-com:vml" xmlns:wp14="http://schemas.microsoft.com/office/word/2010/wordprocessingDrawing" xmlns:wp="http://schemas.openxmlformats.org/drawingml/2006/wordprocessingDrawing" xmlns:w10="urn:schemas-microsoft-com:office:word" xmlns:w="http://schemas.openxmlformats.org/wordprocessingml/2006/main" xmlns:w14="http://schemas.microsoft.com/office/word/2010/wordml" xmlns:w15="http://schemas.microsoft.com/office/word/2012/wordml" xmlns:w16cex="http://schemas.microsoft.com/office/word/2018/wordml/cex" xmlns:w16cid="http://schemas.microsoft.com/office/word/2016/wordml/cid" xmlns:w16="http://schemas.microsoft.com/office/word/2018/wordml" xmlns:w16du="http://schemas.microsoft.com/office/word/2023/wordml/word16du" xmlns:w16sdtdh="http://schemas.microsoft.com/office/word/2020/wordml/sdtdatahash" xmlns:w16sdtfl="http://schemas.microsoft.com/office/word/2024/wordml/sdtformatlock" xmlns:w16se="http://schemas.microsoft.com/office/word/2015/wordml/symex" xmlns:wpg="http://schemas.microsoft.com/office/word/2010/wordprocessingGroup" xmlns:wpi="http://schemas.microsoft.com/office/word/2010/wordprocessingInk" xmlns:wne="http://schemas.microsoft.com/office/word/2006/wordml" xmlns:wps="http://schemas.microsoft.com/office/word/2010/wordprocessingShape" mc:Ignorable="w14 w15 w16se w16cid w16 w16cex w16sdtdh w16sdtfl w16du wp14">
   <w:footnote w:type="separator" w:id="-1">
     <w:p>
       <w:pPr>
@@ -8293,7 +8832,7 @@
 </file>
 
 <file path=word/numbering.xml><?xml version="1.0" encoding="utf-8"?>
-<w:numbering xmlns:wpc="http://schemas.microsoft.com/office/word/2010/wordprocessingCanvas" xmlns:cx="http://schemas.microsoft.com/office/drawing/2014/chartex" xmlns:cx1="http://schemas.microsoft.com/office/drawing/2015/9/8/chartex" xmlns:cx2="http://schemas.microsoft.com/office/drawing/2015/10/21/chartex" xmlns:cx3="http://schemas.microsoft.com/office/drawing/2016/5/9/chartex" xmlns:cx4="http://schemas.microsoft.com/office/drawing/2016/5/10/chartex" xmlns:cx5="http://schemas.microsoft.com/office/drawing/2016/5/11/chartex" xmlns:cx6="http://schemas.microsoft.com/office/drawing/2016/5/12/chartex" xmlns:cx7="http://schemas.microsoft.com/office/drawing/2016/5/13/chartex" xmlns:cx8="http://schemas.microsoft.com/office/drawing/2016/5/14/chartex" xmlns:mc="http://schemas.openxmlformats.org/markup-compatibility/2006" xmlns:aink="http://schemas.microsoft.com/office/drawing/2016/ink" xmlns:am3d="http://schemas.microsoft.com/office/drawing/2017/model3d" xmlns:o="urn:schemas-microsoft-com:office:office" xmlns:oel="http://schemas.microsoft.com/office/2019/extlst" xmlns:r="http://schemas.openxmlformats.org/officeDocument/2006/relationships" xmlns:m="http://schemas.openxmlformats.org/officeDocument/2006/math" xmlns:v="urn:schemas-microsoft-com:vml" xmlns:wp14="http://schemas.microsoft.com/office/word/2010/wordprocessingDrawing" xmlns:wp="http://schemas.openxmlformats.org/drawingml/2006/wordprocessingDrawing" xmlns:w10="urn:schemas-microsoft-com:office:word" xmlns:w="http://schemas.openxmlformats.org/wordprocessingml/2006/main" xmlns:w14="http://schemas.microsoft.com/office/word/2010/wordml" xmlns:w15="http://schemas.microsoft.com/office/word/2012/wordml" xmlns:w16cei="http://schemas.microsoft.com/office/word/2026/wordml/cei" xmlns:w16cex="http://schemas.microsoft.com/office/word/2018/wordml/cex" xmlns:w16cid="http://schemas.microsoft.com/office/word/2016/wordml/cid" xmlns:w16="http://schemas.microsoft.com/office/word/2018/wordml" xmlns:w16du="http://schemas.microsoft.com/office/word/2023/wordml/word16du" xmlns:w16sdtdh="http://schemas.microsoft.com/office/word/2020/wordml/sdtdatahash" xmlns:w16sdtfl="http://schemas.microsoft.com/office/word/2024/wordml/sdtformatlock" xmlns:w16se="http://schemas.microsoft.com/office/word/2015/wordml/symex" xmlns:wpg="http://schemas.microsoft.com/office/word/2010/wordprocessingGroup" xmlns:wpi="http://schemas.microsoft.com/office/word/2010/wordprocessingInk" xmlns:wne="http://schemas.microsoft.com/office/word/2006/wordml" xmlns:wps="http://schemas.microsoft.com/office/word/2010/wordprocessingShape" mc:Ignorable="w14 w15 w16se w16cid w16 w16cex w16sdtdh w16sdtfl w16du wp14">
+<w:numbering xmlns:wpc="http://schemas.microsoft.com/office/word/2010/wordprocessingCanvas" xmlns:cx="http://schemas.microsoft.com/office/drawing/2014/chartex" xmlns:cx1="http://schemas.microsoft.com/office/drawing/2015/9/8/chartex" xmlns:cx2="http://schemas.microsoft.com/office/drawing/2015/10/21/chartex" xmlns:cx3="http://schemas.microsoft.com/office/drawing/2016/5/9/chartex" xmlns:cx4="http://schemas.microsoft.com/office/drawing/2016/5/10/chartex" xmlns:cx5="http://schemas.microsoft.com/office/drawing/2016/5/11/chartex" xmlns:cx6="http://schemas.microsoft.com/office/drawing/2016/5/12/chartex" xmlns:cx7="http://schemas.microsoft.com/office/drawing/2016/5/13/chartex" xmlns:cx8="http://schemas.microsoft.com/office/drawing/2016/5/14/chartex" xmlns:mc="http://schemas.openxmlformats.org/markup-compatibility/2006" xmlns:aink="http://schemas.microsoft.com/office/drawing/2016/ink" xmlns:am3d="http://schemas.microsoft.com/office/drawing/2017/model3d" xmlns:o="urn:schemas-microsoft-com:office:office" xmlns:oel="http://schemas.microsoft.com/office/2019/extlst" xmlns:r="http://schemas.openxmlformats.org/officeDocument/2006/relationships" xmlns:m="http://schemas.openxmlformats.org/officeDocument/2006/math" xmlns:v="urn:schemas-microsoft-com:vml" xmlns:wp14="http://schemas.microsoft.com/office/word/2010/wordprocessingDrawing" xmlns:wp="http://schemas.openxmlformats.org/drawingml/2006/wordprocessingDrawing" xmlns:w10="urn:schemas-microsoft-com:office:word" xmlns:w="http://schemas.openxmlformats.org/wordprocessingml/2006/main" xmlns:w14="http://schemas.microsoft.com/office/word/2010/wordml" xmlns:w15="http://schemas.microsoft.com/office/word/2012/wordml" xmlns:w16cex="http://schemas.microsoft.com/office/word/2018/wordml/cex" xmlns:w16cid="http://schemas.microsoft.com/office/word/2016/wordml/cid" xmlns:w16="http://schemas.microsoft.com/office/word/2018/wordml" xmlns:w16du="http://schemas.microsoft.com/office/word/2023/wordml/word16du" xmlns:w16sdtdh="http://schemas.microsoft.com/office/word/2020/wordml/sdtdatahash" xmlns:w16sdtfl="http://schemas.microsoft.com/office/word/2024/wordml/sdtformatlock" xmlns:w16se="http://schemas.microsoft.com/office/word/2015/wordml/symex" xmlns:wpg="http://schemas.microsoft.com/office/word/2010/wordprocessingGroup" xmlns:wpi="http://schemas.microsoft.com/office/word/2010/wordprocessingInk" xmlns:wne="http://schemas.microsoft.com/office/word/2006/wordml" xmlns:wps="http://schemas.microsoft.com/office/word/2010/wordprocessingShape" mc:Ignorable="w14 w15 w16se w16cid w16 w16cex w16sdtdh w16sdtfl w16du wp14">
   <w:abstractNum w:abstractNumId="0" w15:restartNumberingAfterBreak="0">
     <w:nsid w:val="053A3E4B"/>
     <w:multiLevelType w:val="multilevel"/>
@@ -10608,7 +11147,7 @@
   <w:style w:type="paragraph" w:default="1" w:styleId="Normal">
     <w:name w:val="Normal"/>
     <w:qFormat/>
-    <w:rsid w:val="00696EFB"/>
+    <w:rsid w:val="00A012EF"/>
   </w:style>
   <w:style w:type="paragraph" w:styleId="Ttulo1">
     <w:name w:val="heading 1"/>

</xml_diff>